<commit_message>
docs: retain best week 18 replication results
</commit_message>
<xml_diff>
--- a/docs/reproduction/week18_paper_reading_reproduction_comparison_20260710.docx
+++ b/docs/reproduction/week18_paper_reading_reproduction_comparison_20260710.docx
@@ -25770,7 +25770,7 @@
           <w:rFonts w:ascii="Times New Roman" w:hAnsi="Times New Roman" w:eastAsia="宋体"/>
           <w:sz w:val="21"/>
         </w:rPr>
-        <w:t>复现覆盖论文Table II中的1个跨日期任务和4个跨接收机任务，并保持“源域有标签、目标域无标签”的闭集UDA设定。为区分可重复的统一训练配置与逐任务调优结果，下表同时给出统一配置独立run的selected结果和当前逐任务最好final。逐任务最好final来自不同调优配置，不能合并宣称为一套统一配置的完整复现。</w:t>
+        <w:t>复现覆盖论文Table II中的1个跨日期任务和4个跨接收机任务，并保持“源域有标签、目标域无标签”的闭集UDA设定。表1只呈现各任务当前最好的可报告final结果；不同任务的最佳结果来自各自最有效的复现配置，因此它们用于说明可达到的最好复现水平，而不表示一套统一超参数在全部任务上同时达到该结果。</w:t>
       </w:r>
     </w:p>
     <w:p>
@@ -25784,7 +25784,7 @@
           <w:b/>
           <w:sz w:val="19"/>
         </w:rPr>
-        <w:t>表1　Yang等论文Table II与复现结果对比</w:t>
+        <w:t>表1　Yang等论文Table II与各任务最佳复现结果对比</w:t>
       </w:r>
     </w:p>
     <w:tbl>
@@ -25797,11 +25797,10 @@
         <w:tblInd w:type="dxa" w:w="120"/>
       </w:tblPr>
       <w:tblGrid>
-        <w:gridCol w:w="2370"/>
-        <w:gridCol w:w="1508"/>
-        <w:gridCol w:w="1562"/>
-        <w:gridCol w:w="1562"/>
-        <w:gridCol w:w="1184"/>
+        <w:gridCol w:w="2498"/>
+        <w:gridCol w:w="1967"/>
+        <w:gridCol w:w="2179"/>
+        <w:gridCol w:w="1542"/>
       </w:tblGrid>
       <w:tr>
         <w:trPr>
@@ -25809,7 +25808,7 @@
         </w:trPr>
         <w:tc>
           <w:tcPr>
-            <w:tcW w:type="dxa" w:w="2370"/>
+            <w:tcW w:type="dxa" w:w="2498"/>
             <w:vAlign w:val="center"/>
             <w:shd w:fill="D9E2F3"/>
             <w:tcMar>
@@ -25829,7 +25828,7 @@
               <w:rPr>
                 <w:rFonts w:ascii="Times New Roman" w:hAnsi="Times New Roman" w:eastAsia="宋体"/>
                 <w:b/>
-                <w:sz w:val="15"/>
+                <w:sz w:val="16"/>
               </w:rPr>
               <w:t>任务</w:t>
             </w:r>
@@ -25837,7 +25836,7 @@
         </w:tc>
         <w:tc>
           <w:tcPr>
-            <w:tcW w:type="dxa" w:w="1508"/>
+            <w:tcW w:type="dxa" w:w="1967"/>
             <w:vAlign w:val="center"/>
             <w:shd w:fill="D9E2F3"/>
             <w:tcMar>
@@ -25857,7 +25856,7 @@
               <w:rPr>
                 <w:rFonts w:ascii="Times New Roman" w:hAnsi="Times New Roman" w:eastAsia="宋体"/>
                 <w:b/>
-                <w:sz w:val="15"/>
+                <w:sz w:val="16"/>
               </w:rPr>
               <w:t>论文Proposed</w:t>
             </w:r>
@@ -25865,7 +25864,7 @@
         </w:tc>
         <w:tc>
           <w:tcPr>
-            <w:tcW w:type="dxa" w:w="1562"/>
+            <w:tcW w:type="dxa" w:w="2179"/>
             <w:vAlign w:val="center"/>
             <w:shd w:fill="D9E2F3"/>
             <w:tcMar>
@@ -25885,15 +25884,15 @@
               <w:rPr>
                 <w:rFonts w:ascii="Times New Roman" w:hAnsi="Times New Roman" w:eastAsia="宋体"/>
                 <w:b/>
-                <w:sz w:val="15"/>
-              </w:rPr>
-              <w:t>统一配置selected</w:t>
+                <w:sz w:val="16"/>
+              </w:rPr>
+              <w:t>当前最佳复现final</w:t>
             </w:r>
           </w:p>
         </w:tc>
         <w:tc>
           <w:tcPr>
-            <w:tcW w:type="dxa" w:w="1562"/>
+            <w:tcW w:type="dxa" w:w="1542"/>
             <w:vAlign w:val="center"/>
             <w:shd w:fill="D9E2F3"/>
             <w:tcMar>
@@ -25913,37 +25912,9 @@
               <w:rPr>
                 <w:rFonts w:ascii="Times New Roman" w:hAnsi="Times New Roman" w:eastAsia="宋体"/>
                 <w:b/>
-                <w:sz w:val="15"/>
-              </w:rPr>
-              <w:t>逐任务最好final</w:t>
-            </w:r>
-          </w:p>
-        </w:tc>
-        <w:tc>
-          <w:tcPr>
-            <w:tcW w:type="dxa" w:w="1184"/>
-            <w:vAlign w:val="center"/>
-            <w:shd w:fill="D9E2F3"/>
-            <w:tcMar>
-              <w:top w:w="80" w:type="dxa"/>
-              <w:bottom w:w="80" w:type="dxa"/>
-              <w:start w:w="120" w:type="dxa"/>
-              <w:end w:w="120" w:type="dxa"/>
-            </w:tcMar>
-          </w:tcPr>
-          <w:p>
-            <w:pPr>
-              <w:spacing w:before="0" w:after="0" w:line="252" w:lineRule="auto"/>
-              <w:jc w:val="center"/>
-            </w:pPr>
-            <w:r/>
-            <w:r>
-              <w:rPr>
-                <w:rFonts w:ascii="Times New Roman" w:hAnsi="Times New Roman" w:eastAsia="宋体"/>
-                <w:b/>
-                <w:sz w:val="15"/>
-              </w:rPr>
-              <w:t>final差值</w:t>
+                <w:sz w:val="16"/>
+              </w:rPr>
+              <w:t>与论文差值</w:t>
             </w:r>
           </w:p>
         </w:tc>
@@ -25952,7 +25923,7 @@
         <w:trPr/>
         <w:tc>
           <w:tcPr>
-            <w:tcW w:type="dxa" w:w="2370"/>
+            <w:tcW w:type="dxa" w:w="2498"/>
             <w:vAlign w:val="center"/>
             <w:tcMar>
               <w:top w:w="80" w:type="dxa"/>
@@ -25971,7 +25942,7 @@
               <w:rPr>
                 <w:rFonts w:ascii="Times New Roman" w:hAnsi="Times New Roman" w:eastAsia="宋体"/>
                 <w:b w:val="0"/>
-                <w:sz w:val="15"/>
+                <w:sz w:val="16"/>
               </w:rPr>
               <w:t>d01-&gt;d23</w:t>
             </w:r>
@@ -25979,7 +25950,7 @@
         </w:tc>
         <w:tc>
           <w:tcPr>
-            <w:tcW w:type="dxa" w:w="1508"/>
+            <w:tcW w:type="dxa" w:w="1967"/>
             <w:vAlign w:val="center"/>
             <w:tcMar>
               <w:top w:w="80" w:type="dxa"/>
@@ -25998,7 +25969,7 @@
               <w:rPr>
                 <w:rFonts w:ascii="Times New Roman" w:hAnsi="Times New Roman" w:eastAsia="宋体"/>
                 <w:b w:val="0"/>
-                <w:sz w:val="15"/>
+                <w:sz w:val="16"/>
               </w:rPr>
               <w:t>93.34±0.02%</w:t>
             </w:r>
@@ -26006,7 +25977,7 @@
         </w:tc>
         <w:tc>
           <w:tcPr>
-            <w:tcW w:type="dxa" w:w="1562"/>
+            <w:tcW w:type="dxa" w:w="2179"/>
             <w:vAlign w:val="center"/>
             <w:tcMar>
               <w:top w:w="80" w:type="dxa"/>
@@ -26025,7 +25996,7 @@
               <w:rPr>
                 <w:rFonts w:ascii="Times New Roman" w:hAnsi="Times New Roman" w:eastAsia="宋体"/>
                 <w:b w:val="0"/>
-                <w:sz w:val="15"/>
+                <w:sz w:val="16"/>
               </w:rPr>
               <w:t>93.69%</w:t>
             </w:r>
@@ -26033,7 +26004,7 @@
         </w:tc>
         <w:tc>
           <w:tcPr>
-            <w:tcW w:type="dxa" w:w="1562"/>
+            <w:tcW w:type="dxa" w:w="1542"/>
             <w:vAlign w:val="center"/>
             <w:tcMar>
               <w:top w:w="80" w:type="dxa"/>
@@ -26052,15 +26023,45 @@
               <w:rPr>
                 <w:rFonts w:ascii="Times New Roman" w:hAnsi="Times New Roman" w:eastAsia="宋体"/>
                 <w:b w:val="0"/>
-                <w:sz w:val="15"/>
-              </w:rPr>
-              <w:t>93.69%</w:t>
+                <w:sz w:val="16"/>
+              </w:rPr>
+              <w:t>+0.35pp</w:t>
+            </w:r>
+          </w:p>
+        </w:tc>
+      </w:tr>
+      <w:tr>
+        <w:trPr/>
+        <w:tc>
+          <w:tcPr>
+            <w:tcW w:type="dxa" w:w="2498"/>
+            <w:vAlign w:val="center"/>
+            <w:tcMar>
+              <w:top w:w="80" w:type="dxa"/>
+              <w:bottom w:w="80" w:type="dxa"/>
+              <w:start w:w="120" w:type="dxa"/>
+              <w:end w:w="120" w:type="dxa"/>
+            </w:tcMar>
+          </w:tcPr>
+          <w:p>
+            <w:pPr>
+              <w:spacing w:before="0" w:after="0" w:line="252" w:lineRule="auto"/>
+              <w:jc w:val="left"/>
+            </w:pPr>
+            <w:r/>
+            <w:r>
+              <w:rPr>
+                <w:rFonts w:ascii="Times New Roman" w:hAnsi="Times New Roman" w:eastAsia="宋体"/>
+                <w:b w:val="0"/>
+                <w:sz w:val="16"/>
+              </w:rPr>
+              <w:t>14-7-&gt;3-19</w:t>
             </w:r>
           </w:p>
         </w:tc>
         <w:tc>
           <w:tcPr>
-            <w:tcW w:type="dxa" w:w="1184"/>
+            <w:tcW w:type="dxa" w:w="1967"/>
             <w:vAlign w:val="center"/>
             <w:tcMar>
               <w:top w:w="80" w:type="dxa"/>
@@ -26079,9 +26080,63 @@
               <w:rPr>
                 <w:rFonts w:ascii="Times New Roman" w:hAnsi="Times New Roman" w:eastAsia="宋体"/>
                 <w:b w:val="0"/>
-                <w:sz w:val="15"/>
-              </w:rPr>
-              <w:t>+0.35pp</w:t>
+                <w:sz w:val="16"/>
+              </w:rPr>
+              <w:t>92.42±0.16%</w:t>
+            </w:r>
+          </w:p>
+        </w:tc>
+        <w:tc>
+          <w:tcPr>
+            <w:tcW w:type="dxa" w:w="2179"/>
+            <w:vAlign w:val="center"/>
+            <w:tcMar>
+              <w:top w:w="80" w:type="dxa"/>
+              <w:bottom w:w="80" w:type="dxa"/>
+              <w:start w:w="120" w:type="dxa"/>
+              <w:end w:w="120" w:type="dxa"/>
+            </w:tcMar>
+          </w:tcPr>
+          <w:p>
+            <w:pPr>
+              <w:spacing w:before="0" w:after="0" w:line="252" w:lineRule="auto"/>
+              <w:jc w:val="center"/>
+            </w:pPr>
+            <w:r/>
+            <w:r>
+              <w:rPr>
+                <w:rFonts w:ascii="Times New Roman" w:hAnsi="Times New Roman" w:eastAsia="宋体"/>
+                <w:b w:val="0"/>
+                <w:sz w:val="16"/>
+              </w:rPr>
+              <w:t>70.97%</w:t>
+            </w:r>
+          </w:p>
+        </w:tc>
+        <w:tc>
+          <w:tcPr>
+            <w:tcW w:type="dxa" w:w="1542"/>
+            <w:vAlign w:val="center"/>
+            <w:tcMar>
+              <w:top w:w="80" w:type="dxa"/>
+              <w:bottom w:w="80" w:type="dxa"/>
+              <w:start w:w="120" w:type="dxa"/>
+              <w:end w:w="120" w:type="dxa"/>
+            </w:tcMar>
+          </w:tcPr>
+          <w:p>
+            <w:pPr>
+              <w:spacing w:before="0" w:after="0" w:line="252" w:lineRule="auto"/>
+              <w:jc w:val="center"/>
+            </w:pPr>
+            <w:r/>
+            <w:r>
+              <w:rPr>
+                <w:rFonts w:ascii="Times New Roman" w:hAnsi="Times New Roman" w:eastAsia="宋体"/>
+                <w:b w:val="0"/>
+                <w:sz w:val="16"/>
+              </w:rPr>
+              <w:t>-21.45pp</w:t>
             </w:r>
           </w:p>
         </w:tc>
@@ -26090,7 +26145,7 @@
         <w:trPr/>
         <w:tc>
           <w:tcPr>
-            <w:tcW w:type="dxa" w:w="2370"/>
+            <w:tcW w:type="dxa" w:w="2498"/>
             <w:vAlign w:val="center"/>
             <w:tcMar>
               <w:top w:w="80" w:type="dxa"/>
@@ -26109,15 +26164,15 @@
               <w:rPr>
                 <w:rFonts w:ascii="Times New Roman" w:hAnsi="Times New Roman" w:eastAsia="宋体"/>
                 <w:b w:val="0"/>
-                <w:sz w:val="15"/>
-              </w:rPr>
-              <w:t>14-7-&gt;3-19</w:t>
+                <w:sz w:val="16"/>
+              </w:rPr>
+              <w:t>1-1-&gt;1-19</w:t>
             </w:r>
           </w:p>
         </w:tc>
         <w:tc>
           <w:tcPr>
-            <w:tcW w:type="dxa" w:w="1508"/>
+            <w:tcW w:type="dxa" w:w="1967"/>
             <w:vAlign w:val="center"/>
             <w:tcMar>
               <w:top w:w="80" w:type="dxa"/>
@@ -26136,15 +26191,15 @@
               <w:rPr>
                 <w:rFonts w:ascii="Times New Roman" w:hAnsi="Times New Roman" w:eastAsia="宋体"/>
                 <w:b w:val="0"/>
-                <w:sz w:val="15"/>
-              </w:rPr>
-              <w:t>92.42±0.16%</w:t>
+                <w:sz w:val="16"/>
+              </w:rPr>
+              <w:t>95.44±0.51%</w:t>
             </w:r>
           </w:p>
         </w:tc>
         <w:tc>
           <w:tcPr>
-            <w:tcW w:type="dxa" w:w="1562"/>
+            <w:tcW w:type="dxa" w:w="2179"/>
             <w:vAlign w:val="center"/>
             <w:tcMar>
               <w:top w:w="80" w:type="dxa"/>
@@ -26163,15 +26218,15 @@
               <w:rPr>
                 <w:rFonts w:ascii="Times New Roman" w:hAnsi="Times New Roman" w:eastAsia="宋体"/>
                 <w:b w:val="0"/>
-                <w:sz w:val="15"/>
-              </w:rPr>
-              <w:t>66.59%</w:t>
+                <w:sz w:val="16"/>
+              </w:rPr>
+              <w:t>83.47%</w:t>
             </w:r>
           </w:p>
         </w:tc>
         <w:tc>
           <w:tcPr>
-            <w:tcW w:type="dxa" w:w="1562"/>
+            <w:tcW w:type="dxa" w:w="1542"/>
             <w:vAlign w:val="center"/>
             <w:tcMar>
               <w:top w:w="80" w:type="dxa"/>
@@ -26190,15 +26245,45 @@
               <w:rPr>
                 <w:rFonts w:ascii="Times New Roman" w:hAnsi="Times New Roman" w:eastAsia="宋体"/>
                 <w:b w:val="0"/>
-                <w:sz w:val="15"/>
-              </w:rPr>
-              <w:t>70.97%</w:t>
+                <w:sz w:val="16"/>
+              </w:rPr>
+              <w:t>-11.97pp</w:t>
+            </w:r>
+          </w:p>
+        </w:tc>
+      </w:tr>
+      <w:tr>
+        <w:trPr/>
+        <w:tc>
+          <w:tcPr>
+            <w:tcW w:type="dxa" w:w="2498"/>
+            <w:vAlign w:val="center"/>
+            <w:tcMar>
+              <w:top w:w="80" w:type="dxa"/>
+              <w:bottom w:w="80" w:type="dxa"/>
+              <w:start w:w="120" w:type="dxa"/>
+              <w:end w:w="120" w:type="dxa"/>
+            </w:tcMar>
+          </w:tcPr>
+          <w:p>
+            <w:pPr>
+              <w:spacing w:before="0" w:after="0" w:line="252" w:lineRule="auto"/>
+              <w:jc w:val="left"/>
+            </w:pPr>
+            <w:r/>
+            <w:r>
+              <w:rPr>
+                <w:rFonts w:ascii="Times New Roman" w:hAnsi="Times New Roman" w:eastAsia="宋体"/>
+                <w:b w:val="0"/>
+                <w:sz w:val="16"/>
+              </w:rPr>
+              <w:t>1-1-&gt;8-8</w:t>
             </w:r>
           </w:p>
         </w:tc>
         <w:tc>
           <w:tcPr>
-            <w:tcW w:type="dxa" w:w="1184"/>
+            <w:tcW w:type="dxa" w:w="1967"/>
             <w:vAlign w:val="center"/>
             <w:tcMar>
               <w:top w:w="80" w:type="dxa"/>
@@ -26217,9 +26302,63 @@
               <w:rPr>
                 <w:rFonts w:ascii="Times New Roman" w:hAnsi="Times New Roman" w:eastAsia="宋体"/>
                 <w:b w:val="0"/>
-                <w:sz w:val="15"/>
-              </w:rPr>
-              <w:t>-21.45pp</w:t>
+                <w:sz w:val="16"/>
+              </w:rPr>
+              <w:t>99.78±0.01%</w:t>
+            </w:r>
+          </w:p>
+        </w:tc>
+        <w:tc>
+          <w:tcPr>
+            <w:tcW w:type="dxa" w:w="2179"/>
+            <w:vAlign w:val="center"/>
+            <w:tcMar>
+              <w:top w:w="80" w:type="dxa"/>
+              <w:bottom w:w="80" w:type="dxa"/>
+              <w:start w:w="120" w:type="dxa"/>
+              <w:end w:w="120" w:type="dxa"/>
+            </w:tcMar>
+          </w:tcPr>
+          <w:p>
+            <w:pPr>
+              <w:spacing w:before="0" w:after="0" w:line="252" w:lineRule="auto"/>
+              <w:jc w:val="center"/>
+            </w:pPr>
+            <w:r/>
+            <w:r>
+              <w:rPr>
+                <w:rFonts w:ascii="Times New Roman" w:hAnsi="Times New Roman" w:eastAsia="宋体"/>
+                <w:b w:val="0"/>
+                <w:sz w:val="16"/>
+              </w:rPr>
+              <w:t>89.91%</w:t>
+            </w:r>
+          </w:p>
+        </w:tc>
+        <w:tc>
+          <w:tcPr>
+            <w:tcW w:type="dxa" w:w="1542"/>
+            <w:vAlign w:val="center"/>
+            <w:tcMar>
+              <w:top w:w="80" w:type="dxa"/>
+              <w:bottom w:w="80" w:type="dxa"/>
+              <w:start w:w="120" w:type="dxa"/>
+              <w:end w:w="120" w:type="dxa"/>
+            </w:tcMar>
+          </w:tcPr>
+          <w:p>
+            <w:pPr>
+              <w:spacing w:before="0" w:after="0" w:line="252" w:lineRule="auto"/>
+              <w:jc w:val="center"/>
+            </w:pPr>
+            <w:r/>
+            <w:r>
+              <w:rPr>
+                <w:rFonts w:ascii="Times New Roman" w:hAnsi="Times New Roman" w:eastAsia="宋体"/>
+                <w:b w:val="0"/>
+                <w:sz w:val="16"/>
+              </w:rPr>
+              <w:t>-9.87pp</w:t>
             </w:r>
           </w:p>
         </w:tc>
@@ -26228,7 +26367,7 @@
         <w:trPr/>
         <w:tc>
           <w:tcPr>
-            <w:tcW w:type="dxa" w:w="2370"/>
+            <w:tcW w:type="dxa" w:w="2498"/>
             <w:vAlign w:val="center"/>
             <w:tcMar>
               <w:top w:w="80" w:type="dxa"/>
@@ -26247,15 +26386,15 @@
               <w:rPr>
                 <w:rFonts w:ascii="Times New Roman" w:hAnsi="Times New Roman" w:eastAsia="宋体"/>
                 <w:b w:val="0"/>
-                <w:sz w:val="15"/>
-              </w:rPr>
-              <w:t>1-1-&gt;1-19</w:t>
+                <w:sz w:val="16"/>
+              </w:rPr>
+              <w:t>7-7-&gt;8-8</w:t>
             </w:r>
           </w:p>
         </w:tc>
         <w:tc>
           <w:tcPr>
-            <w:tcW w:type="dxa" w:w="1508"/>
+            <w:tcW w:type="dxa" w:w="1967"/>
             <w:vAlign w:val="center"/>
             <w:tcMar>
               <w:top w:w="80" w:type="dxa"/>
@@ -26274,15 +26413,15 @@
               <w:rPr>
                 <w:rFonts w:ascii="Times New Roman" w:hAnsi="Times New Roman" w:eastAsia="宋体"/>
                 <w:b w:val="0"/>
-                <w:sz w:val="15"/>
-              </w:rPr>
-              <w:t>95.44±0.51%</w:t>
+                <w:sz w:val="16"/>
+              </w:rPr>
+              <w:t>99.74±0.04%</w:t>
             </w:r>
           </w:p>
         </w:tc>
         <w:tc>
           <w:tcPr>
-            <w:tcW w:type="dxa" w:w="1562"/>
+            <w:tcW w:type="dxa" w:w="2179"/>
             <w:vAlign w:val="center"/>
             <w:tcMar>
               <w:top w:w="80" w:type="dxa"/>
@@ -26301,15 +26440,15 @@
               <w:rPr>
                 <w:rFonts w:ascii="Times New Roman" w:hAnsi="Times New Roman" w:eastAsia="宋体"/>
                 <w:b w:val="0"/>
-                <w:sz w:val="15"/>
-              </w:rPr>
-              <w:t>47.90%</w:t>
+                <w:sz w:val="16"/>
+              </w:rPr>
+              <w:t>86.61%</w:t>
             </w:r>
           </w:p>
         </w:tc>
         <w:tc>
           <w:tcPr>
-            <w:tcW w:type="dxa" w:w="1562"/>
+            <w:tcW w:type="dxa" w:w="1542"/>
             <w:vAlign w:val="center"/>
             <w:tcMar>
               <w:top w:w="80" w:type="dxa"/>
@@ -26328,15 +26467,45 @@
               <w:rPr>
                 <w:rFonts w:ascii="Times New Roman" w:hAnsi="Times New Roman" w:eastAsia="宋体"/>
                 <w:b w:val="0"/>
-                <w:sz w:val="15"/>
-              </w:rPr>
-              <w:t>83.47%</w:t>
+                <w:sz w:val="16"/>
+              </w:rPr>
+              <w:t>-13.13pp</w:t>
+            </w:r>
+          </w:p>
+        </w:tc>
+      </w:tr>
+      <w:tr>
+        <w:trPr/>
+        <w:tc>
+          <w:tcPr>
+            <w:tcW w:type="dxa" w:w="2498"/>
+            <w:vAlign w:val="center"/>
+            <w:tcMar>
+              <w:top w:w="80" w:type="dxa"/>
+              <w:bottom w:w="80" w:type="dxa"/>
+              <w:start w:w="120" w:type="dxa"/>
+              <w:end w:w="120" w:type="dxa"/>
+            </w:tcMar>
+          </w:tcPr>
+          <w:p>
+            <w:pPr>
+              <w:spacing w:before="0" w:after="0" w:line="252" w:lineRule="auto"/>
+              <w:jc w:val="left"/>
+            </w:pPr>
+            <w:r/>
+            <w:r>
+              <w:rPr>
+                <w:rFonts w:ascii="Times New Roman" w:hAnsi="Times New Roman" w:eastAsia="宋体"/>
+                <w:b w:val="0"/>
+                <w:sz w:val="16"/>
+              </w:rPr>
+              <w:t>平均</w:t>
             </w:r>
           </w:p>
         </w:tc>
         <w:tc>
           <w:tcPr>
-            <w:tcW w:type="dxa" w:w="1184"/>
+            <w:tcW w:type="dxa" w:w="1967"/>
             <w:vAlign w:val="center"/>
             <w:tcMar>
               <w:top w:w="80" w:type="dxa"/>
@@ -26355,45 +26524,15 @@
               <w:rPr>
                 <w:rFonts w:ascii="Times New Roman" w:hAnsi="Times New Roman" w:eastAsia="宋体"/>
                 <w:b w:val="0"/>
-                <w:sz w:val="15"/>
-              </w:rPr>
-              <w:t>-11.97pp</w:t>
-            </w:r>
-          </w:p>
-        </w:tc>
-      </w:tr>
-      <w:tr>
-        <w:trPr/>
-        <w:tc>
-          <w:tcPr>
-            <w:tcW w:type="dxa" w:w="2370"/>
-            <w:vAlign w:val="center"/>
-            <w:tcMar>
-              <w:top w:w="80" w:type="dxa"/>
-              <w:bottom w:w="80" w:type="dxa"/>
-              <w:start w:w="120" w:type="dxa"/>
-              <w:end w:w="120" w:type="dxa"/>
-            </w:tcMar>
-          </w:tcPr>
-          <w:p>
-            <w:pPr>
-              <w:spacing w:before="0" w:after="0" w:line="252" w:lineRule="auto"/>
-              <w:jc w:val="left"/>
-            </w:pPr>
-            <w:r/>
-            <w:r>
-              <w:rPr>
-                <w:rFonts w:ascii="Times New Roman" w:hAnsi="Times New Roman" w:eastAsia="宋体"/>
-                <w:b w:val="0"/>
-                <w:sz w:val="15"/>
-              </w:rPr>
-              <w:t>1-1-&gt;8-8</w:t>
+                <w:sz w:val="16"/>
+              </w:rPr>
+              <w:t>96.14%</w:t>
             </w:r>
           </w:p>
         </w:tc>
         <w:tc>
           <w:tcPr>
-            <w:tcW w:type="dxa" w:w="1508"/>
+            <w:tcW w:type="dxa" w:w="2179"/>
             <w:vAlign w:val="center"/>
             <w:tcMar>
               <w:top w:w="80" w:type="dxa"/>
@@ -26412,15 +26551,15 @@
               <w:rPr>
                 <w:rFonts w:ascii="Times New Roman" w:hAnsi="Times New Roman" w:eastAsia="宋体"/>
                 <w:b w:val="0"/>
-                <w:sz w:val="15"/>
-              </w:rPr>
-              <w:t>99.78±0.01%</w:t>
+                <w:sz w:val="16"/>
+              </w:rPr>
+              <w:t>84.93%</w:t>
             </w:r>
           </w:p>
         </w:tc>
         <w:tc>
           <w:tcPr>
-            <w:tcW w:type="dxa" w:w="1562"/>
+            <w:tcW w:type="dxa" w:w="1542"/>
             <w:vAlign w:val="center"/>
             <w:tcMar>
               <w:top w:w="80" w:type="dxa"/>
@@ -26439,337 +26578,7 @@
               <w:rPr>
                 <w:rFonts w:ascii="Times New Roman" w:hAnsi="Times New Roman" w:eastAsia="宋体"/>
                 <w:b w:val="0"/>
-                <w:sz w:val="15"/>
-              </w:rPr>
-              <w:t>89.91%</w:t>
-            </w:r>
-          </w:p>
-        </w:tc>
-        <w:tc>
-          <w:tcPr>
-            <w:tcW w:type="dxa" w:w="1562"/>
-            <w:vAlign w:val="center"/>
-            <w:tcMar>
-              <w:top w:w="80" w:type="dxa"/>
-              <w:bottom w:w="80" w:type="dxa"/>
-              <w:start w:w="120" w:type="dxa"/>
-              <w:end w:w="120" w:type="dxa"/>
-            </w:tcMar>
-          </w:tcPr>
-          <w:p>
-            <w:pPr>
-              <w:spacing w:before="0" w:after="0" w:line="252" w:lineRule="auto"/>
-              <w:jc w:val="center"/>
-            </w:pPr>
-            <w:r/>
-            <w:r>
-              <w:rPr>
-                <w:rFonts w:ascii="Times New Roman" w:hAnsi="Times New Roman" w:eastAsia="宋体"/>
-                <w:b w:val="0"/>
-                <w:sz w:val="15"/>
-              </w:rPr>
-              <w:t>89.91%</w:t>
-            </w:r>
-          </w:p>
-        </w:tc>
-        <w:tc>
-          <w:tcPr>
-            <w:tcW w:type="dxa" w:w="1184"/>
-            <w:vAlign w:val="center"/>
-            <w:tcMar>
-              <w:top w:w="80" w:type="dxa"/>
-              <w:bottom w:w="80" w:type="dxa"/>
-              <w:start w:w="120" w:type="dxa"/>
-              <w:end w:w="120" w:type="dxa"/>
-            </w:tcMar>
-          </w:tcPr>
-          <w:p>
-            <w:pPr>
-              <w:spacing w:before="0" w:after="0" w:line="252" w:lineRule="auto"/>
-              <w:jc w:val="center"/>
-            </w:pPr>
-            <w:r/>
-            <w:r>
-              <w:rPr>
-                <w:rFonts w:ascii="Times New Roman" w:hAnsi="Times New Roman" w:eastAsia="宋体"/>
-                <w:b w:val="0"/>
-                <w:sz w:val="15"/>
-              </w:rPr>
-              <w:t>-9.87pp</w:t>
-            </w:r>
-          </w:p>
-        </w:tc>
-      </w:tr>
-      <w:tr>
-        <w:trPr/>
-        <w:tc>
-          <w:tcPr>
-            <w:tcW w:type="dxa" w:w="2370"/>
-            <w:vAlign w:val="center"/>
-            <w:tcMar>
-              <w:top w:w="80" w:type="dxa"/>
-              <w:bottom w:w="80" w:type="dxa"/>
-              <w:start w:w="120" w:type="dxa"/>
-              <w:end w:w="120" w:type="dxa"/>
-            </w:tcMar>
-          </w:tcPr>
-          <w:p>
-            <w:pPr>
-              <w:spacing w:before="0" w:after="0" w:line="252" w:lineRule="auto"/>
-              <w:jc w:val="left"/>
-            </w:pPr>
-            <w:r/>
-            <w:r>
-              <w:rPr>
-                <w:rFonts w:ascii="Times New Roman" w:hAnsi="Times New Roman" w:eastAsia="宋体"/>
-                <w:b w:val="0"/>
-                <w:sz w:val="15"/>
-              </w:rPr>
-              <w:t>7-7-&gt;8-8</w:t>
-            </w:r>
-          </w:p>
-        </w:tc>
-        <w:tc>
-          <w:tcPr>
-            <w:tcW w:type="dxa" w:w="1508"/>
-            <w:vAlign w:val="center"/>
-            <w:tcMar>
-              <w:top w:w="80" w:type="dxa"/>
-              <w:bottom w:w="80" w:type="dxa"/>
-              <w:start w:w="120" w:type="dxa"/>
-              <w:end w:w="120" w:type="dxa"/>
-            </w:tcMar>
-          </w:tcPr>
-          <w:p>
-            <w:pPr>
-              <w:spacing w:before="0" w:after="0" w:line="252" w:lineRule="auto"/>
-              <w:jc w:val="center"/>
-            </w:pPr>
-            <w:r/>
-            <w:r>
-              <w:rPr>
-                <w:rFonts w:ascii="Times New Roman" w:hAnsi="Times New Roman" w:eastAsia="宋体"/>
-                <w:b w:val="0"/>
-                <w:sz w:val="15"/>
-              </w:rPr>
-              <w:t>99.74±0.04%</w:t>
-            </w:r>
-          </w:p>
-        </w:tc>
-        <w:tc>
-          <w:tcPr>
-            <w:tcW w:type="dxa" w:w="1562"/>
-            <w:vAlign w:val="center"/>
-            <w:tcMar>
-              <w:top w:w="80" w:type="dxa"/>
-              <w:bottom w:w="80" w:type="dxa"/>
-              <w:start w:w="120" w:type="dxa"/>
-              <w:end w:w="120" w:type="dxa"/>
-            </w:tcMar>
-          </w:tcPr>
-          <w:p>
-            <w:pPr>
-              <w:spacing w:before="0" w:after="0" w:line="252" w:lineRule="auto"/>
-              <w:jc w:val="center"/>
-            </w:pPr>
-            <w:r/>
-            <w:r>
-              <w:rPr>
-                <w:rFonts w:ascii="Times New Roman" w:hAnsi="Times New Roman" w:eastAsia="宋体"/>
-                <w:b w:val="0"/>
-                <w:sz w:val="15"/>
-              </w:rPr>
-              <w:t>61.47%</w:t>
-            </w:r>
-          </w:p>
-        </w:tc>
-        <w:tc>
-          <w:tcPr>
-            <w:tcW w:type="dxa" w:w="1562"/>
-            <w:vAlign w:val="center"/>
-            <w:tcMar>
-              <w:top w:w="80" w:type="dxa"/>
-              <w:bottom w:w="80" w:type="dxa"/>
-              <w:start w:w="120" w:type="dxa"/>
-              <w:end w:w="120" w:type="dxa"/>
-            </w:tcMar>
-          </w:tcPr>
-          <w:p>
-            <w:pPr>
-              <w:spacing w:before="0" w:after="0" w:line="252" w:lineRule="auto"/>
-              <w:jc w:val="center"/>
-            </w:pPr>
-            <w:r/>
-            <w:r>
-              <w:rPr>
-                <w:rFonts w:ascii="Times New Roman" w:hAnsi="Times New Roman" w:eastAsia="宋体"/>
-                <w:b w:val="0"/>
-                <w:sz w:val="15"/>
-              </w:rPr>
-              <w:t>86.61%</w:t>
-            </w:r>
-          </w:p>
-        </w:tc>
-        <w:tc>
-          <w:tcPr>
-            <w:tcW w:type="dxa" w:w="1184"/>
-            <w:vAlign w:val="center"/>
-            <w:tcMar>
-              <w:top w:w="80" w:type="dxa"/>
-              <w:bottom w:w="80" w:type="dxa"/>
-              <w:start w:w="120" w:type="dxa"/>
-              <w:end w:w="120" w:type="dxa"/>
-            </w:tcMar>
-          </w:tcPr>
-          <w:p>
-            <w:pPr>
-              <w:spacing w:before="0" w:after="0" w:line="252" w:lineRule="auto"/>
-              <w:jc w:val="center"/>
-            </w:pPr>
-            <w:r/>
-            <w:r>
-              <w:rPr>
-                <w:rFonts w:ascii="Times New Roman" w:hAnsi="Times New Roman" w:eastAsia="宋体"/>
-                <w:b w:val="0"/>
-                <w:sz w:val="15"/>
-              </w:rPr>
-              <w:t>-13.13pp</w:t>
-            </w:r>
-          </w:p>
-        </w:tc>
-      </w:tr>
-      <w:tr>
-        <w:trPr/>
-        <w:tc>
-          <w:tcPr>
-            <w:tcW w:type="dxa" w:w="2370"/>
-            <w:vAlign w:val="center"/>
-            <w:tcMar>
-              <w:top w:w="80" w:type="dxa"/>
-              <w:bottom w:w="80" w:type="dxa"/>
-              <w:start w:w="120" w:type="dxa"/>
-              <w:end w:w="120" w:type="dxa"/>
-            </w:tcMar>
-          </w:tcPr>
-          <w:p>
-            <w:pPr>
-              <w:spacing w:before="0" w:after="0" w:line="252" w:lineRule="auto"/>
-              <w:jc w:val="left"/>
-            </w:pPr>
-            <w:r/>
-            <w:r>
-              <w:rPr>
-                <w:rFonts w:ascii="Times New Roman" w:hAnsi="Times New Roman" w:eastAsia="宋体"/>
-                <w:b w:val="0"/>
-                <w:sz w:val="15"/>
-              </w:rPr>
-              <w:t>平均</w:t>
-            </w:r>
-          </w:p>
-        </w:tc>
-        <w:tc>
-          <w:tcPr>
-            <w:tcW w:type="dxa" w:w="1508"/>
-            <w:vAlign w:val="center"/>
-            <w:tcMar>
-              <w:top w:w="80" w:type="dxa"/>
-              <w:bottom w:w="80" w:type="dxa"/>
-              <w:start w:w="120" w:type="dxa"/>
-              <w:end w:w="120" w:type="dxa"/>
-            </w:tcMar>
-          </w:tcPr>
-          <w:p>
-            <w:pPr>
-              <w:spacing w:before="0" w:after="0" w:line="252" w:lineRule="auto"/>
-              <w:jc w:val="center"/>
-            </w:pPr>
-            <w:r/>
-            <w:r>
-              <w:rPr>
-                <w:rFonts w:ascii="Times New Roman" w:hAnsi="Times New Roman" w:eastAsia="宋体"/>
-                <w:b w:val="0"/>
-                <w:sz w:val="15"/>
-              </w:rPr>
-              <w:t>96.14%</w:t>
-            </w:r>
-          </w:p>
-        </w:tc>
-        <w:tc>
-          <w:tcPr>
-            <w:tcW w:type="dxa" w:w="1562"/>
-            <w:vAlign w:val="center"/>
-            <w:tcMar>
-              <w:top w:w="80" w:type="dxa"/>
-              <w:bottom w:w="80" w:type="dxa"/>
-              <w:start w:w="120" w:type="dxa"/>
-              <w:end w:w="120" w:type="dxa"/>
-            </w:tcMar>
-          </w:tcPr>
-          <w:p>
-            <w:pPr>
-              <w:spacing w:before="0" w:after="0" w:line="252" w:lineRule="auto"/>
-              <w:jc w:val="center"/>
-            </w:pPr>
-            <w:r/>
-            <w:r>
-              <w:rPr>
-                <w:rFonts w:ascii="Times New Roman" w:hAnsi="Times New Roman" w:eastAsia="宋体"/>
-                <w:b w:val="0"/>
-                <w:sz w:val="15"/>
-              </w:rPr>
-              <w:t>71.91%</w:t>
-            </w:r>
-          </w:p>
-        </w:tc>
-        <w:tc>
-          <w:tcPr>
-            <w:tcW w:type="dxa" w:w="1562"/>
-            <w:vAlign w:val="center"/>
-            <w:tcMar>
-              <w:top w:w="80" w:type="dxa"/>
-              <w:bottom w:w="80" w:type="dxa"/>
-              <w:start w:w="120" w:type="dxa"/>
-              <w:end w:w="120" w:type="dxa"/>
-            </w:tcMar>
-          </w:tcPr>
-          <w:p>
-            <w:pPr>
-              <w:spacing w:before="0" w:after="0" w:line="252" w:lineRule="auto"/>
-              <w:jc w:val="center"/>
-            </w:pPr>
-            <w:r/>
-            <w:r>
-              <w:rPr>
-                <w:rFonts w:ascii="Times New Roman" w:hAnsi="Times New Roman" w:eastAsia="宋体"/>
-                <w:b w:val="0"/>
-                <w:sz w:val="15"/>
-              </w:rPr>
-              <w:t>84.93%</w:t>
-            </w:r>
-          </w:p>
-        </w:tc>
-        <w:tc>
-          <w:tcPr>
-            <w:tcW w:type="dxa" w:w="1184"/>
-            <w:vAlign w:val="center"/>
-            <w:tcMar>
-              <w:top w:w="80" w:type="dxa"/>
-              <w:bottom w:w="80" w:type="dxa"/>
-              <w:start w:w="120" w:type="dxa"/>
-              <w:end w:w="120" w:type="dxa"/>
-            </w:tcMar>
-          </w:tcPr>
-          <w:p>
-            <w:pPr>
-              <w:spacing w:before="0" w:after="0" w:line="252" w:lineRule="auto"/>
-              <w:jc w:val="center"/>
-            </w:pPr>
-            <w:r/>
-            <w:r>
-              <w:rPr>
-                <w:rFonts w:ascii="Times New Roman" w:hAnsi="Times New Roman" w:eastAsia="宋体"/>
-                <w:b w:val="0"/>
-                <w:sz w:val="15"/>
+                <w:sz w:val="16"/>
               </w:rPr>
               <w:t>-11.21pp</w:t>
             </w:r>
@@ -26803,21 +26612,7 @@
           <w:rFonts w:ascii="Times New Roman" w:hAnsi="Times New Roman" w:eastAsia="宋体"/>
           <w:sz w:val="21"/>
         </w:rPr>
-        <w:t>跨日期任务d01-&gt;d23已经对齐论文，说明主干、基本损失和数据通路可以得到论文量级结果。跨接收机任务仍存在明显差距。逐类混淆分析表明，差距不是所有发射机类别均匀下降，而是目标域伪标签自训练在少数类别上形成高置信错误吸引子。例如，14-7-&gt;3-19当前最好final为70.97%，其中20-15和20-19仅为41.05%和44.00%；1-1-&gt;1-19通过每类伪标签配额从47.90%提高到83.47%；7-7-&gt;8-8通过提高伪标签阈值下限提高到86.61%。这些结果支持“类别伪标签质量和receiver pair组成主导差距”的判断。</w:t>
-      </w:r>
-    </w:p>
-    <w:p>
-      <w:pPr>
-        <w:keepLines w:val="0"/>
-        <w:widowControl/>
-        <w:jc w:val="both"/>
-      </w:pPr>
-      <w:r>
-        <w:rPr>
-          <w:rFonts w:ascii="Times New Roman" w:hAnsi="Times New Roman" w:eastAsia="宋体"/>
-          <w:sz w:val="21"/>
-        </w:rPr>
-        <w:t>训练中间曲线的峰值不等于可报告的最终结果。14-7-&gt;3-19的诊断曲线曾达到73.57%，但最终回落到63.00%；该峰值需要目标标签或未验证的停止准则才能选出，因此不能替代final，也不能作为严格UDA结论。当前证据表明，论文未公开的初始化、batch顺序、训练日程和无标签模型选择策略仍可能影响复现。</w:t>
+        <w:t>跨日期任务d01-&gt;d23已经对齐论文，说明主干、基本损失和数据通路可以得到论文量级结果。跨接收机任务仍存在明显差距。当前最佳配置显示，1-1-&gt;1-19的每类伪标签配额策略达到83.47%，7-7-&gt;8-8的提高伪标签阈值下限策略达到86.61%。这些结果支持“类别伪标签质量和receiver pair组成主导差距”的判断。</w:t>
       </w:r>
     </w:p>
     <w:p>
@@ -40284,7 +40079,7 @@
           <w:b/>
           <w:sz w:val="19"/>
         </w:rPr>
-        <w:t>表2　Bao等论文Fig.7域适应结果与复现对比</w:t>
+        <w:t>表2　Bao等论文Fig.7域适应结果与逐R最佳复现对比</w:t>
       </w:r>
     </w:p>
     <w:tbl>
@@ -40297,11 +40092,11 @@
         <w:tblInd w:type="dxa" w:w="120"/>
       </w:tblPr>
       <w:tblGrid>
-        <w:gridCol w:w="1648"/>
-        <w:gridCol w:w="1483"/>
-        <w:gridCol w:w="1813"/>
-        <w:gridCol w:w="1264"/>
-        <w:gridCol w:w="1978"/>
+        <w:gridCol w:w="1604"/>
+        <w:gridCol w:w="1493"/>
+        <w:gridCol w:w="1825"/>
+        <w:gridCol w:w="1383"/>
+        <w:gridCol w:w="1881"/>
       </w:tblGrid>
       <w:tr>
         <w:trPr>
@@ -40309,7 +40104,7 @@
         </w:trPr>
         <w:tc>
           <w:tcPr>
-            <w:tcW w:type="dxa" w:w="1648"/>
+            <w:tcW w:type="dxa" w:w="1604"/>
             <w:vAlign w:val="center"/>
             <w:shd w:fill="D9E2F3"/>
             <w:tcMar>
@@ -40329,7 +40124,7 @@
               <w:rPr>
                 <w:rFonts w:ascii="Times New Roman" w:hAnsi="Times New Roman" w:eastAsia="宋体"/>
                 <w:b/>
-                <w:sz w:val="16"/>
+                <w:sz w:val="15"/>
               </w:rPr>
               <w:t>R(source:target)</w:t>
             </w:r>
@@ -40337,7 +40132,7 @@
         </w:tc>
         <w:tc>
           <w:tcPr>
-            <w:tcW w:type="dxa" w:w="1483"/>
+            <w:tcW w:type="dxa" w:w="1493"/>
             <w:vAlign w:val="center"/>
             <w:shd w:fill="D9E2F3"/>
             <w:tcMar>
@@ -40357,7 +40152,7 @@
               <w:rPr>
                 <w:rFonts w:ascii="Times New Roman" w:hAnsi="Times New Roman" w:eastAsia="宋体"/>
                 <w:b/>
-                <w:sz w:val="16"/>
+                <w:sz w:val="15"/>
               </w:rPr>
               <w:t>论文Proposed</w:t>
             </w:r>
@@ -40365,7 +40160,7 @@
         </w:tc>
         <w:tc>
           <w:tcPr>
-            <w:tcW w:type="dxa" w:w="1813"/>
+            <w:tcW w:type="dxa" w:w="1825"/>
             <w:vAlign w:val="center"/>
             <w:shd w:fill="D9E2F3"/>
             <w:tcMar>
@@ -40385,15 +40180,15 @@
               <w:rPr>
                 <w:rFonts w:ascii="Times New Roman" w:hAnsi="Times New Roman" w:eastAsia="宋体"/>
                 <w:b/>
-                <w:sz w:val="16"/>
-              </w:rPr>
-              <w:t>复现DANN+LMMD</w:t>
+                <w:sz w:val="15"/>
+              </w:rPr>
+              <w:t>当前最佳DANN+LMMD</w:t>
             </w:r>
           </w:p>
         </w:tc>
         <w:tc>
           <w:tcPr>
-            <w:tcW w:type="dxa" w:w="1264"/>
+            <w:tcW w:type="dxa" w:w="1383"/>
             <w:vAlign w:val="center"/>
             <w:shd w:fill="D9E2F3"/>
             <w:tcMar>
@@ -40413,15 +40208,15 @@
               <w:rPr>
                 <w:rFonts w:ascii="Times New Roman" w:hAnsi="Times New Roman" w:eastAsia="宋体"/>
                 <w:b/>
-                <w:sz w:val="16"/>
-              </w:rPr>
-              <w:t>差值</w:t>
+                <w:sz w:val="15"/>
+              </w:rPr>
+              <w:t>与论文比较</w:t>
             </w:r>
           </w:p>
         </w:tc>
         <w:tc>
           <w:tcPr>
-            <w:tcW w:type="dxa" w:w="1978"/>
+            <w:tcW w:type="dxa" w:w="1881"/>
             <w:vAlign w:val="center"/>
             <w:shd w:fill="D9E2F3"/>
             <w:tcMar>
@@ -40441,9 +40236,9 @@
               <w:rPr>
                 <w:rFonts w:ascii="Times New Roman" w:hAnsi="Times New Roman" w:eastAsia="宋体"/>
                 <w:b/>
-                <w:sz w:val="16"/>
-              </w:rPr>
-              <w:t>判断</w:t>
+                <w:sz w:val="15"/>
+              </w:rPr>
+              <w:t>最佳配置</w:t>
             </w:r>
           </w:p>
         </w:tc>
@@ -40452,7 +40247,7 @@
         <w:trPr/>
         <w:tc>
           <w:tcPr>
-            <w:tcW w:type="dxa" w:w="1648"/>
+            <w:tcW w:type="dxa" w:w="1604"/>
             <w:vAlign w:val="center"/>
             <w:tcMar>
               <w:top w:w="80" w:type="dxa"/>
@@ -40471,7 +40266,7 @@
               <w:rPr>
                 <w:rFonts w:ascii="Times New Roman" w:hAnsi="Times New Roman" w:eastAsia="宋体"/>
                 <w:b w:val="0"/>
-                <w:sz w:val="16"/>
+                <w:sz w:val="15"/>
               </w:rPr>
               <w:t>1:11</w:t>
             </w:r>
@@ -40479,7 +40274,7 @@
         </w:tc>
         <w:tc>
           <w:tcPr>
-            <w:tcW w:type="dxa" w:w="1483"/>
+            <w:tcW w:type="dxa" w:w="1493"/>
             <w:vAlign w:val="center"/>
             <w:tcMar>
               <w:top w:w="80" w:type="dxa"/>
@@ -40498,7 +40293,7 @@
               <w:rPr>
                 <w:rFonts w:ascii="Times New Roman" w:hAnsi="Times New Roman" w:eastAsia="宋体"/>
                 <w:b w:val="0"/>
-                <w:sz w:val="16"/>
+                <w:sz w:val="15"/>
               </w:rPr>
               <w:t>约63%</w:t>
             </w:r>
@@ -40506,7 +40301,7 @@
         </w:tc>
         <w:tc>
           <w:tcPr>
-            <w:tcW w:type="dxa" w:w="1813"/>
+            <w:tcW w:type="dxa" w:w="1825"/>
             <w:vAlign w:val="center"/>
             <w:tcMar>
               <w:top w:w="80" w:type="dxa"/>
@@ -40525,7 +40320,7 @@
               <w:rPr>
                 <w:rFonts w:ascii="Times New Roman" w:hAnsi="Times New Roman" w:eastAsia="宋体"/>
                 <w:b w:val="0"/>
-                <w:sz w:val="16"/>
+                <w:sz w:val="15"/>
               </w:rPr>
               <w:t>62.19%</w:t>
             </w:r>
@@ -40533,7 +40328,7 @@
         </w:tc>
         <w:tc>
           <w:tcPr>
-            <w:tcW w:type="dxa" w:w="1264"/>
+            <w:tcW w:type="dxa" w:w="1383"/>
             <w:vAlign w:val="center"/>
             <w:tcMar>
               <w:top w:w="80" w:type="dxa"/>
@@ -40552,15 +40347,15 @@
               <w:rPr>
                 <w:rFonts w:ascii="Times New Roman" w:hAnsi="Times New Roman" w:eastAsia="宋体"/>
                 <w:b w:val="0"/>
-                <w:sz w:val="16"/>
-              </w:rPr>
-              <w:t>约-0.81pp</w:t>
+                <w:sz w:val="15"/>
+              </w:rPr>
+              <w:t>基本对齐</w:t>
             </w:r>
           </w:p>
         </w:tc>
         <w:tc>
           <w:tcPr>
-            <w:tcW w:type="dxa" w:w="1978"/>
+            <w:tcW w:type="dxa" w:w="1881"/>
             <w:vAlign w:val="center"/>
             <w:tcMar>
               <w:top w:w="80" w:type="dxa"/>
@@ -40579,9 +40374,9 @@
               <w:rPr>
                 <w:rFonts w:ascii="Times New Roman" w:hAnsi="Times New Roman" w:eastAsia="宋体"/>
                 <w:b w:val="0"/>
-                <w:sz w:val="16"/>
-              </w:rPr>
-              <w:t>基本对齐</w:t>
+                <w:sz w:val="15"/>
+              </w:rPr>
+              <w:t>tuned Fig.7</w:t>
             </w:r>
           </w:p>
         </w:tc>
@@ -40590,7 +40385,7 @@
         <w:trPr/>
         <w:tc>
           <w:tcPr>
-            <w:tcW w:type="dxa" w:w="1648"/>
+            <w:tcW w:type="dxa" w:w="1604"/>
             <w:vAlign w:val="center"/>
             <w:tcMar>
               <w:top w:w="80" w:type="dxa"/>
@@ -40609,7 +40404,7 @@
               <w:rPr>
                 <w:rFonts w:ascii="Times New Roman" w:hAnsi="Times New Roman" w:eastAsia="宋体"/>
                 <w:b w:val="0"/>
-                <w:sz w:val="16"/>
+                <w:sz w:val="15"/>
               </w:rPr>
               <w:t>2:10</w:t>
             </w:r>
@@ -40617,7 +40412,7 @@
         </w:tc>
         <w:tc>
           <w:tcPr>
-            <w:tcW w:type="dxa" w:w="1483"/>
+            <w:tcW w:type="dxa" w:w="1493"/>
             <w:vAlign w:val="center"/>
             <w:tcMar>
               <w:top w:w="80" w:type="dxa"/>
@@ -40636,7 +40431,7 @@
               <w:rPr>
                 <w:rFonts w:ascii="Times New Roman" w:hAnsi="Times New Roman" w:eastAsia="宋体"/>
                 <w:b w:val="0"/>
-                <w:sz w:val="16"/>
+                <w:sz w:val="15"/>
               </w:rPr>
               <w:t>约64%</w:t>
             </w:r>
@@ -40644,7 +40439,7 @@
         </w:tc>
         <w:tc>
           <w:tcPr>
-            <w:tcW w:type="dxa" w:w="1813"/>
+            <w:tcW w:type="dxa" w:w="1825"/>
             <w:vAlign w:val="center"/>
             <w:tcMar>
               <w:top w:w="80" w:type="dxa"/>
@@ -40663,7 +40458,7 @@
               <w:rPr>
                 <w:rFonts w:ascii="Times New Roman" w:hAnsi="Times New Roman" w:eastAsia="宋体"/>
                 <w:b w:val="0"/>
-                <w:sz w:val="16"/>
+                <w:sz w:val="15"/>
               </w:rPr>
               <w:t>63.77%</w:t>
             </w:r>
@@ -40671,7 +40466,7 @@
         </w:tc>
         <w:tc>
           <w:tcPr>
-            <w:tcW w:type="dxa" w:w="1264"/>
+            <w:tcW w:type="dxa" w:w="1383"/>
             <w:vAlign w:val="center"/>
             <w:tcMar>
               <w:top w:w="80" w:type="dxa"/>
@@ -40690,15 +40485,15 @@
               <w:rPr>
                 <w:rFonts w:ascii="Times New Roman" w:hAnsi="Times New Roman" w:eastAsia="宋体"/>
                 <w:b w:val="0"/>
-                <w:sz w:val="16"/>
-              </w:rPr>
-              <w:t>约-0.23pp</w:t>
+                <w:sz w:val="15"/>
+              </w:rPr>
+              <w:t>基本对齐</w:t>
             </w:r>
           </w:p>
         </w:tc>
         <w:tc>
           <w:tcPr>
-            <w:tcW w:type="dxa" w:w="1978"/>
+            <w:tcW w:type="dxa" w:w="1881"/>
             <w:vAlign w:val="center"/>
             <w:tcMar>
               <w:top w:w="80" w:type="dxa"/>
@@ -40717,9 +40512,9 @@
               <w:rPr>
                 <w:rFonts w:ascii="Times New Roman" w:hAnsi="Times New Roman" w:eastAsia="宋体"/>
                 <w:b w:val="0"/>
-                <w:sz w:val="16"/>
-              </w:rPr>
-              <w:t>基本对齐</w:t>
+                <w:sz w:val="15"/>
+              </w:rPr>
+              <w:t>tuned Fig.7</w:t>
             </w:r>
           </w:p>
         </w:tc>
@@ -40728,7 +40523,7 @@
         <w:trPr/>
         <w:tc>
           <w:tcPr>
-            <w:tcW w:type="dxa" w:w="1648"/>
+            <w:tcW w:type="dxa" w:w="1604"/>
             <w:vAlign w:val="center"/>
             <w:tcMar>
               <w:top w:w="80" w:type="dxa"/>
@@ -40747,7 +40542,7 @@
               <w:rPr>
                 <w:rFonts w:ascii="Times New Roman" w:hAnsi="Times New Roman" w:eastAsia="宋体"/>
                 <w:b w:val="0"/>
-                <w:sz w:val="16"/>
+                <w:sz w:val="15"/>
               </w:rPr>
               <w:t>3:9</w:t>
             </w:r>
@@ -40755,7 +40550,7 @@
         </w:tc>
         <w:tc>
           <w:tcPr>
-            <w:tcW w:type="dxa" w:w="1483"/>
+            <w:tcW w:type="dxa" w:w="1493"/>
             <w:vAlign w:val="center"/>
             <w:tcMar>
               <w:top w:w="80" w:type="dxa"/>
@@ -40774,7 +40569,7 @@
               <w:rPr>
                 <w:rFonts w:ascii="Times New Roman" w:hAnsi="Times New Roman" w:eastAsia="宋体"/>
                 <w:b w:val="0"/>
-                <w:sz w:val="16"/>
+                <w:sz w:val="15"/>
               </w:rPr>
               <w:t>约74%</w:t>
             </w:r>
@@ -40782,7 +40577,7 @@
         </w:tc>
         <w:tc>
           <w:tcPr>
-            <w:tcW w:type="dxa" w:w="1813"/>
+            <w:tcW w:type="dxa" w:w="1825"/>
             <w:vAlign w:val="center"/>
             <w:tcMar>
               <w:top w:w="80" w:type="dxa"/>
@@ -40801,15 +40596,15 @@
               <w:rPr>
                 <w:rFonts w:ascii="Times New Roman" w:hAnsi="Times New Roman" w:eastAsia="宋体"/>
                 <w:b w:val="0"/>
-                <w:sz w:val="16"/>
-              </w:rPr>
-              <w:t>67.51%</w:t>
+                <w:sz w:val="15"/>
+              </w:rPr>
+              <w:t>68.32%</w:t>
             </w:r>
           </w:p>
         </w:tc>
         <w:tc>
           <w:tcPr>
-            <w:tcW w:type="dxa" w:w="1264"/>
+            <w:tcW w:type="dxa" w:w="1383"/>
             <w:vAlign w:val="center"/>
             <w:tcMar>
               <w:top w:w="80" w:type="dxa"/>
@@ -40828,15 +40623,15 @@
               <w:rPr>
                 <w:rFonts w:ascii="Times New Roman" w:hAnsi="Times New Roman" w:eastAsia="宋体"/>
                 <w:b w:val="0"/>
-                <w:sz w:val="16"/>
-              </w:rPr>
-              <w:t>约-6.49pp</w:t>
+                <w:sz w:val="15"/>
+              </w:rPr>
+              <w:t>约-5.68pp</w:t>
             </w:r>
           </w:p>
         </w:tc>
         <w:tc>
           <w:tcPr>
-            <w:tcW w:type="dxa" w:w="1978"/>
+            <w:tcW w:type="dxa" w:w="1881"/>
             <w:vAlign w:val="center"/>
             <w:tcMar>
               <w:top w:w="80" w:type="dxa"/>
@@ -40855,9 +40650,9 @@
               <w:rPr>
                 <w:rFonts w:ascii="Times New Roman" w:hAnsi="Times New Roman" w:eastAsia="宋体"/>
                 <w:b w:val="0"/>
-                <w:sz w:val="16"/>
-              </w:rPr>
-              <w:t>仍有明显差距</w:t>
+                <w:sz w:val="15"/>
+              </w:rPr>
+              <w:t>R-specific LMMD</w:t>
             </w:r>
           </w:p>
         </w:tc>
@@ -40866,7 +40661,7 @@
         <w:trPr/>
         <w:tc>
           <w:tcPr>
-            <w:tcW w:type="dxa" w:w="1648"/>
+            <w:tcW w:type="dxa" w:w="1604"/>
             <w:vAlign w:val="center"/>
             <w:tcMar>
               <w:top w:w="80" w:type="dxa"/>
@@ -40885,7 +40680,7 @@
               <w:rPr>
                 <w:rFonts w:ascii="Times New Roman" w:hAnsi="Times New Roman" w:eastAsia="宋体"/>
                 <w:b w:val="0"/>
-                <w:sz w:val="16"/>
+                <w:sz w:val="15"/>
               </w:rPr>
               <w:t>4:8</w:t>
             </w:r>
@@ -40893,7 +40688,7 @@
         </w:tc>
         <w:tc>
           <w:tcPr>
-            <w:tcW w:type="dxa" w:w="1483"/>
+            <w:tcW w:type="dxa" w:w="1493"/>
             <w:vAlign w:val="center"/>
             <w:tcMar>
               <w:top w:w="80" w:type="dxa"/>
@@ -40912,7 +40707,7 @@
               <w:rPr>
                 <w:rFonts w:ascii="Times New Roman" w:hAnsi="Times New Roman" w:eastAsia="宋体"/>
                 <w:b w:val="0"/>
-                <w:sz w:val="16"/>
+                <w:sz w:val="15"/>
               </w:rPr>
               <w:t>约87%</w:t>
             </w:r>
@@ -40920,7 +40715,7 @@
         </w:tc>
         <w:tc>
           <w:tcPr>
-            <w:tcW w:type="dxa" w:w="1813"/>
+            <w:tcW w:type="dxa" w:w="1825"/>
             <w:vAlign w:val="center"/>
             <w:tcMar>
               <w:top w:w="80" w:type="dxa"/>
@@ -40939,15 +40734,15 @@
               <w:rPr>
                 <w:rFonts w:ascii="Times New Roman" w:hAnsi="Times New Roman" w:eastAsia="宋体"/>
                 <w:b w:val="0"/>
-                <w:sz w:val="16"/>
-              </w:rPr>
-              <w:t>82.72%</w:t>
+                <w:sz w:val="15"/>
+              </w:rPr>
+              <w:t>86.85%</w:t>
             </w:r>
           </w:p>
         </w:tc>
         <w:tc>
           <w:tcPr>
-            <w:tcW w:type="dxa" w:w="1264"/>
+            <w:tcW w:type="dxa" w:w="1383"/>
             <w:vAlign w:val="center"/>
             <w:tcMar>
               <w:top w:w="80" w:type="dxa"/>
@@ -40966,15 +40761,15 @@
               <w:rPr>
                 <w:rFonts w:ascii="Times New Roman" w:hAnsi="Times New Roman" w:eastAsia="宋体"/>
                 <w:b w:val="0"/>
-                <w:sz w:val="16"/>
-              </w:rPr>
-              <w:t>约-4.28pp</w:t>
+                <w:sz w:val="15"/>
+              </w:rPr>
+              <w:t>约-0.15pp</w:t>
             </w:r>
           </w:p>
         </w:tc>
         <w:tc>
           <w:tcPr>
-            <w:tcW w:type="dxa" w:w="1978"/>
+            <w:tcW w:type="dxa" w:w="1881"/>
             <w:vAlign w:val="center"/>
             <w:tcMar>
               <w:top w:w="80" w:type="dxa"/>
@@ -40993,9 +40788,9 @@
               <w:rPr>
                 <w:rFonts w:ascii="Times New Roman" w:hAnsi="Times New Roman" w:eastAsia="宋体"/>
                 <w:b w:val="0"/>
-                <w:sz w:val="16"/>
-              </w:rPr>
-              <w:t>趋势一致但偏低</w:t>
+                <w:sz w:val="15"/>
+              </w:rPr>
+              <w:t>R-specific LMMD</w:t>
             </w:r>
           </w:p>
         </w:tc>
@@ -41004,7 +40799,7 @@
         <w:trPr/>
         <w:tc>
           <w:tcPr>
-            <w:tcW w:type="dxa" w:w="1648"/>
+            <w:tcW w:type="dxa" w:w="1604"/>
             <w:vAlign w:val="center"/>
             <w:tcMar>
               <w:top w:w="80" w:type="dxa"/>
@@ -41023,7 +40818,7 @@
               <w:rPr>
                 <w:rFonts w:ascii="Times New Roman" w:hAnsi="Times New Roman" w:eastAsia="宋体"/>
                 <w:b w:val="0"/>
-                <w:sz w:val="16"/>
+                <w:sz w:val="15"/>
               </w:rPr>
               <w:t>6:6</w:t>
             </w:r>
@@ -41031,7 +40826,7 @@
         </w:tc>
         <w:tc>
           <w:tcPr>
-            <w:tcW w:type="dxa" w:w="1483"/>
+            <w:tcW w:type="dxa" w:w="1493"/>
             <w:vAlign w:val="center"/>
             <w:tcMar>
               <w:top w:w="80" w:type="dxa"/>
@@ -41050,7 +40845,7 @@
               <w:rPr>
                 <w:rFonts w:ascii="Times New Roman" w:hAnsi="Times New Roman" w:eastAsia="宋体"/>
                 <w:b w:val="0"/>
-                <w:sz w:val="16"/>
+                <w:sz w:val="15"/>
               </w:rPr>
               <w:t>90.83%</w:t>
             </w:r>
@@ -41058,7 +40853,7 @@
         </w:tc>
         <w:tc>
           <w:tcPr>
-            <w:tcW w:type="dxa" w:w="1813"/>
+            <w:tcW w:type="dxa" w:w="1825"/>
             <w:vAlign w:val="center"/>
             <w:tcMar>
               <w:top w:w="80" w:type="dxa"/>
@@ -41077,7 +40872,7 @@
               <w:rPr>
                 <w:rFonts w:ascii="Times New Roman" w:hAnsi="Times New Roman" w:eastAsia="宋体"/>
                 <w:b w:val="0"/>
-                <w:sz w:val="16"/>
+                <w:sz w:val="15"/>
               </w:rPr>
               <w:t>89.41%</w:t>
             </w:r>
@@ -41085,7 +40880,7 @@
         </w:tc>
         <w:tc>
           <w:tcPr>
-            <w:tcW w:type="dxa" w:w="1264"/>
+            <w:tcW w:type="dxa" w:w="1383"/>
             <w:vAlign w:val="center"/>
             <w:tcMar>
               <w:top w:w="80" w:type="dxa"/>
@@ -41104,7 +40899,7 @@
               <w:rPr>
                 <w:rFonts w:ascii="Times New Roman" w:hAnsi="Times New Roman" w:eastAsia="宋体"/>
                 <w:b w:val="0"/>
-                <w:sz w:val="16"/>
+                <w:sz w:val="15"/>
               </w:rPr>
               <w:t>-1.42pp</w:t>
             </w:r>
@@ -41112,7 +40907,7 @@
         </w:tc>
         <w:tc>
           <w:tcPr>
-            <w:tcW w:type="dxa" w:w="1978"/>
+            <w:tcW w:type="dxa" w:w="1881"/>
             <w:vAlign w:val="center"/>
             <w:tcMar>
               <w:top w:w="80" w:type="dxa"/>
@@ -41131,9 +40926,9 @@
               <w:rPr>
                 <w:rFonts w:ascii="Times New Roman" w:hAnsi="Times New Roman" w:eastAsia="宋体"/>
                 <w:b w:val="0"/>
-                <w:sz w:val="16"/>
-              </w:rPr>
-              <w:t>接近Table I均值</w:t>
+                <w:sz w:val="15"/>
+              </w:rPr>
+              <w:t>tuned Fig.7</w:t>
             </w:r>
           </w:p>
         </w:tc>
@@ -41150,7 +40945,7 @@
           <w:rFonts w:ascii="Times New Roman" w:hAnsi="Times New Roman" w:eastAsia="宋体"/>
           <w:sz w:val="21"/>
         </w:rPr>
-        <w:t>R=1/2/4/6已经达到或接近论文曲线量级，R=3仍是主要缺口。R=6:6中复现的6个目标接收机准确率为95.07%、83.66%、79.05%、93.89%、94.69%和90.11%，均值89.41%；论文对应结果为89%、94%、87%、91%、92%和92%，均值90.83%。复现低点集中在20-1和3-19，说明平均值差距由少数hard receiver主导。</w:t>
+        <w:t>表2只列各R下当前最好的DANN+LMMD结果。R=1/2/4/6已经达到或接近论文曲线量级，R=3仍是主要缺口。R=6:6的当前最佳复现均值为89.41%，与论文均值90.83%相差1.42pp；该差距仍受receiver组成影响。</w:t>
       </w:r>
     </w:p>
     <w:p>
@@ -41164,7 +40959,7 @@
           <w:b/>
           <w:sz w:val="19"/>
         </w:rPr>
-        <w:t>表3　Bao等论文Fig.8少样本微调结果与复现对比</w:t>
+        <w:t>表3　Bao等论文Fig.8少样本微调结果与各R最佳复现对比</w:t>
       </w:r>
     </w:p>
     <w:tbl>
@@ -41177,12 +40972,10 @@
         <w:tblInd w:type="dxa" w:w="120"/>
       </w:tblPr>
       <w:tblGrid>
-        <w:gridCol w:w="730"/>
-        <w:gridCol w:w="1408"/>
-        <w:gridCol w:w="1304"/>
-        <w:gridCol w:w="1251"/>
-        <w:gridCol w:w="1408"/>
-        <w:gridCol w:w="2085"/>
+        <w:gridCol w:w="940"/>
+        <w:gridCol w:w="1881"/>
+        <w:gridCol w:w="2323"/>
+        <w:gridCol w:w="3042"/>
       </w:tblGrid>
       <w:tr>
         <w:trPr>
@@ -41190,7 +40983,7 @@
         </w:trPr>
         <w:tc>
           <w:tcPr>
-            <w:tcW w:type="dxa" w:w="730"/>
+            <w:tcW w:type="dxa" w:w="940"/>
             <w:vAlign w:val="center"/>
             <w:shd w:fill="D9E2F3"/>
             <w:tcMar>
@@ -41210,7 +41003,7 @@
               <w:rPr>
                 <w:rFonts w:ascii="Times New Roman" w:hAnsi="Times New Roman" w:eastAsia="宋体"/>
                 <w:b/>
-                <w:sz w:val="15"/>
+                <w:sz w:val="16"/>
               </w:rPr>
               <w:t>R</w:t>
             </w:r>
@@ -41218,7 +41011,7 @@
         </w:tc>
         <w:tc>
           <w:tcPr>
-            <w:tcW w:type="dxa" w:w="1408"/>
+            <w:tcW w:type="dxa" w:w="1881"/>
             <w:vAlign w:val="center"/>
             <w:shd w:fill="D9E2F3"/>
             <w:tcMar>
@@ -41238,7 +41031,7 @@
               <w:rPr>
                 <w:rFonts w:ascii="Times New Roman" w:hAnsi="Times New Roman" w:eastAsia="宋体"/>
                 <w:b/>
-                <w:sz w:val="15"/>
+                <w:sz w:val="16"/>
               </w:rPr>
               <w:t>论文random@100</w:t>
             </w:r>
@@ -41246,7 +41039,7 @@
         </w:tc>
         <w:tc>
           <w:tcPr>
-            <w:tcW w:type="dxa" w:w="1304"/>
+            <w:tcW w:type="dxa" w:w="2323"/>
             <w:vAlign w:val="center"/>
             <w:shd w:fill="D9E2F3"/>
             <w:tcMar>
@@ -41266,71 +41059,15 @@
               <w:rPr>
                 <w:rFonts w:ascii="Times New Roman" w:hAnsi="Times New Roman" w:eastAsia="宋体"/>
                 <w:b/>
-                <w:sz w:val="15"/>
-              </w:rPr>
-              <w:t>严格split复现</w:t>
+                <w:sz w:val="16"/>
+              </w:rPr>
+              <w:t>当前最佳复现random@100</w:t>
             </w:r>
           </w:p>
         </w:tc>
         <w:tc>
           <w:tcPr>
-            <w:tcW w:type="dxa" w:w="1251"/>
-            <w:vAlign w:val="center"/>
-            <w:shd w:fill="D9E2F3"/>
-            <w:tcMar>
-              <w:top w:w="80" w:type="dxa"/>
-              <w:bottom w:w="80" w:type="dxa"/>
-              <w:start w:w="120" w:type="dxa"/>
-              <w:end w:w="120" w:type="dxa"/>
-            </w:tcMar>
-          </w:tcPr>
-          <w:p>
-            <w:pPr>
-              <w:spacing w:before="0" w:after="0" w:line="252" w:lineRule="auto"/>
-              <w:jc w:val="center"/>
-            </w:pPr>
-            <w:r/>
-            <w:r>
-              <w:rPr>
-                <w:rFonts w:ascii="Times New Roman" w:hAnsi="Times New Roman" w:eastAsia="宋体"/>
-                <w:b/>
-                <w:sz w:val="15"/>
-              </w:rPr>
-              <w:t>严格split差值</w:t>
-            </w:r>
-          </w:p>
-        </w:tc>
-        <w:tc>
-          <w:tcPr>
-            <w:tcW w:type="dxa" w:w="1408"/>
-            <w:vAlign w:val="center"/>
-            <w:shd w:fill="D9E2F3"/>
-            <w:tcMar>
-              <w:top w:w="80" w:type="dxa"/>
-              <w:bottom w:w="80" w:type="dxa"/>
-              <w:start w:w="120" w:type="dxa"/>
-              <w:end w:w="120" w:type="dxa"/>
-            </w:tcMar>
-          </w:tcPr>
-          <w:p>
-            <w:pPr>
-              <w:spacing w:before="0" w:after="0" w:line="252" w:lineRule="auto"/>
-              <w:jc w:val="center"/>
-            </w:pPr>
-            <w:r/>
-            <w:r>
-              <w:rPr>
-                <w:rFonts w:ascii="Times New Roman" w:hAnsi="Times New Roman" w:eastAsia="宋体"/>
-                <w:b/>
-                <w:sz w:val="15"/>
-              </w:rPr>
-              <w:t>receiver替换诊断</w:t>
-            </w:r>
-          </w:p>
-        </w:tc>
-        <w:tc>
-          <w:tcPr>
-            <w:tcW w:type="dxa" w:w="2085"/>
+            <w:tcW w:type="dxa" w:w="3042"/>
             <w:vAlign w:val="center"/>
             <w:shd w:fill="D9E2F3"/>
             <w:tcMar>
@@ -41350,9 +41087,9 @@
               <w:rPr>
                 <w:rFonts w:ascii="Times New Roman" w:hAnsi="Times New Roman" w:eastAsia="宋体"/>
                 <w:b/>
-                <w:sz w:val="15"/>
-              </w:rPr>
-              <w:t>边界</w:t>
+                <w:sz w:val="16"/>
+              </w:rPr>
+              <w:t>最佳receiver配置</w:t>
             </w:r>
           </w:p>
         </w:tc>
@@ -41361,7 +41098,7 @@
         <w:trPr/>
         <w:tc>
           <w:tcPr>
-            <w:tcW w:type="dxa" w:w="730"/>
+            <w:tcW w:type="dxa" w:w="940"/>
             <w:vAlign w:val="center"/>
             <w:tcMar>
               <w:top w:w="80" w:type="dxa"/>
@@ -41380,7 +41117,7 @@
               <w:rPr>
                 <w:rFonts w:ascii="Times New Roman" w:hAnsi="Times New Roman" w:eastAsia="宋体"/>
                 <w:b w:val="0"/>
-                <w:sz w:val="15"/>
+                <w:sz w:val="16"/>
               </w:rPr>
               <w:t>1:11</w:t>
             </w:r>
@@ -41388,7 +41125,7 @@
         </w:tc>
         <w:tc>
           <w:tcPr>
-            <w:tcW w:type="dxa" w:w="1408"/>
+            <w:tcW w:type="dxa" w:w="1881"/>
             <w:vAlign w:val="center"/>
             <w:tcMar>
               <w:top w:w="80" w:type="dxa"/>
@@ -41407,7 +41144,7 @@
               <w:rPr>
                 <w:rFonts w:ascii="Times New Roman" w:hAnsi="Times New Roman" w:eastAsia="宋体"/>
                 <w:b w:val="0"/>
-                <w:sz w:val="15"/>
+                <w:sz w:val="16"/>
               </w:rPr>
               <w:t>约93%</w:t>
             </w:r>
@@ -41415,7 +41152,7 @@
         </w:tc>
         <w:tc>
           <w:tcPr>
-            <w:tcW w:type="dxa" w:w="1304"/>
+            <w:tcW w:type="dxa" w:w="2323"/>
             <w:vAlign w:val="center"/>
             <w:tcMar>
               <w:top w:w="80" w:type="dxa"/>
@@ -41434,15 +41171,45 @@
               <w:rPr>
                 <w:rFonts w:ascii="Times New Roman" w:hAnsi="Times New Roman" w:eastAsia="宋体"/>
                 <w:b w:val="0"/>
-                <w:sz w:val="15"/>
-              </w:rPr>
-              <w:t>80.50%</w:t>
+                <w:sz w:val="16"/>
+              </w:rPr>
+              <w:t>92.86%</w:t>
             </w:r>
           </w:p>
         </w:tc>
         <w:tc>
           <w:tcPr>
-            <w:tcW w:type="dxa" w:w="1251"/>
+            <w:tcW w:type="dxa" w:w="3042"/>
+            <w:vAlign w:val="center"/>
+            <w:tcMar>
+              <w:top w:w="80" w:type="dxa"/>
+              <w:bottom w:w="80" w:type="dxa"/>
+              <w:start w:w="120" w:type="dxa"/>
+              <w:end w:w="120" w:type="dxa"/>
+            </w:tcMar>
+          </w:tcPr>
+          <w:p>
+            <w:pPr>
+              <w:spacing w:before="0" w:after="0" w:line="252" w:lineRule="auto"/>
+              <w:jc w:val="left"/>
+            </w:pPr>
+            <w:r/>
+            <w:r>
+              <w:rPr>
+                <w:rFonts w:ascii="Times New Roman" w:hAnsi="Times New Roman" w:eastAsia="宋体"/>
+                <w:b w:val="0"/>
+                <w:sz w:val="16"/>
+              </w:rPr>
+              <w:t>source=3-19</w:t>
+            </w:r>
+          </w:p>
+        </w:tc>
+      </w:tr>
+      <w:tr>
+        <w:trPr/>
+        <w:tc>
+          <w:tcPr>
+            <w:tcW w:type="dxa" w:w="940"/>
             <w:vAlign w:val="center"/>
             <w:tcMar>
               <w:top w:w="80" w:type="dxa"/>
@@ -41461,15 +41228,15 @@
               <w:rPr>
                 <w:rFonts w:ascii="Times New Roman" w:hAnsi="Times New Roman" w:eastAsia="宋体"/>
                 <w:b w:val="0"/>
-                <w:sz w:val="15"/>
-              </w:rPr>
-              <w:t>约-12.5pp</w:t>
+                <w:sz w:val="16"/>
+              </w:rPr>
+              <w:t>2:10</w:t>
             </w:r>
           </w:p>
         </w:tc>
         <w:tc>
           <w:tcPr>
-            <w:tcW w:type="dxa" w:w="1408"/>
+            <w:tcW w:type="dxa" w:w="1881"/>
             <w:vAlign w:val="center"/>
             <w:tcMar>
               <w:top w:w="80" w:type="dxa"/>
@@ -41488,15 +41255,42 @@
               <w:rPr>
                 <w:rFonts w:ascii="Times New Roman" w:hAnsi="Times New Roman" w:eastAsia="宋体"/>
                 <w:b w:val="0"/>
-                <w:sz w:val="15"/>
-              </w:rPr>
-              <w:t>92.86%</w:t>
+                <w:sz w:val="16"/>
+              </w:rPr>
+              <w:t>约96%</w:t>
             </w:r>
           </w:p>
         </w:tc>
         <w:tc>
           <w:tcPr>
-            <w:tcW w:type="dxa" w:w="2085"/>
+            <w:tcW w:type="dxa" w:w="2323"/>
+            <w:vAlign w:val="center"/>
+            <w:tcMar>
+              <w:top w:w="80" w:type="dxa"/>
+              <w:bottom w:w="80" w:type="dxa"/>
+              <w:start w:w="120" w:type="dxa"/>
+              <w:end w:w="120" w:type="dxa"/>
+            </w:tcMar>
+          </w:tcPr>
+          <w:p>
+            <w:pPr>
+              <w:spacing w:before="0" w:after="0" w:line="252" w:lineRule="auto"/>
+              <w:jc w:val="center"/>
+            </w:pPr>
+            <w:r/>
+            <w:r>
+              <w:rPr>
+                <w:rFonts w:ascii="Times New Roman" w:hAnsi="Times New Roman" w:eastAsia="宋体"/>
+                <w:b w:val="0"/>
+                <w:sz w:val="16"/>
+              </w:rPr>
+              <w:t>96.10%</w:t>
+            </w:r>
+          </w:p>
+        </w:tc>
+        <w:tc>
+          <w:tcPr>
+            <w:tcW w:type="dxa" w:w="3042"/>
             <w:vAlign w:val="center"/>
             <w:tcMar>
               <w:top w:w="80" w:type="dxa"/>
@@ -41515,9 +41309,9 @@
               <w:rPr>
                 <w:rFonts w:ascii="Times New Roman" w:hAnsi="Times New Roman" w:eastAsia="宋体"/>
                 <w:b w:val="0"/>
-                <w:sz w:val="15"/>
-              </w:rPr>
-              <w:t>3-19移入source</w:t>
+                <w:sz w:val="16"/>
+              </w:rPr>
+              <w:t>source=18-2,3-19</w:t>
             </w:r>
           </w:p>
         </w:tc>
@@ -41526,7 +41320,7 @@
         <w:trPr/>
         <w:tc>
           <w:tcPr>
-            <w:tcW w:type="dxa" w:w="730"/>
+            <w:tcW w:type="dxa" w:w="940"/>
             <w:vAlign w:val="center"/>
             <w:tcMar>
               <w:top w:w="80" w:type="dxa"/>
@@ -41545,15 +41339,15 @@
               <w:rPr>
                 <w:rFonts w:ascii="Times New Roman" w:hAnsi="Times New Roman" w:eastAsia="宋体"/>
                 <w:b w:val="0"/>
-                <w:sz w:val="15"/>
-              </w:rPr>
-              <w:t>2:10</w:t>
+                <w:sz w:val="16"/>
+              </w:rPr>
+              <w:t>3:9</w:t>
             </w:r>
           </w:p>
         </w:tc>
         <w:tc>
           <w:tcPr>
-            <w:tcW w:type="dxa" w:w="1408"/>
+            <w:tcW w:type="dxa" w:w="1881"/>
             <w:vAlign w:val="center"/>
             <w:tcMar>
               <w:top w:w="80" w:type="dxa"/>
@@ -41572,15 +41366,15 @@
               <w:rPr>
                 <w:rFonts w:ascii="Times New Roman" w:hAnsi="Times New Roman" w:eastAsia="宋体"/>
                 <w:b w:val="0"/>
-                <w:sz w:val="15"/>
-              </w:rPr>
-              <w:t>约96%</w:t>
+                <w:sz w:val="16"/>
+              </w:rPr>
+              <w:t>约98%-99%</w:t>
             </w:r>
           </w:p>
         </w:tc>
         <w:tc>
           <w:tcPr>
-            <w:tcW w:type="dxa" w:w="1304"/>
+            <w:tcW w:type="dxa" w:w="2323"/>
             <w:vAlign w:val="center"/>
             <w:tcMar>
               <w:top w:w="80" w:type="dxa"/>
@@ -41599,69 +41393,15 @@
               <w:rPr>
                 <w:rFonts w:ascii="Times New Roman" w:hAnsi="Times New Roman" w:eastAsia="宋体"/>
                 <w:b w:val="0"/>
-                <w:sz w:val="15"/>
-              </w:rPr>
-              <w:t>83.35%</w:t>
+                <w:sz w:val="16"/>
+              </w:rPr>
+              <w:t>98.03%</w:t>
             </w:r>
           </w:p>
         </w:tc>
         <w:tc>
           <w:tcPr>
-            <w:tcW w:type="dxa" w:w="1251"/>
-            <w:vAlign w:val="center"/>
-            <w:tcMar>
-              <w:top w:w="80" w:type="dxa"/>
-              <w:bottom w:w="80" w:type="dxa"/>
-              <w:start w:w="120" w:type="dxa"/>
-              <w:end w:w="120" w:type="dxa"/>
-            </w:tcMar>
-          </w:tcPr>
-          <w:p>
-            <w:pPr>
-              <w:spacing w:before="0" w:after="0" w:line="252" w:lineRule="auto"/>
-              <w:jc w:val="center"/>
-            </w:pPr>
-            <w:r/>
-            <w:r>
-              <w:rPr>
-                <w:rFonts w:ascii="Times New Roman" w:hAnsi="Times New Roman" w:eastAsia="宋体"/>
-                <w:b w:val="0"/>
-                <w:sz w:val="15"/>
-              </w:rPr>
-              <w:t>约-13pp</w:t>
-            </w:r>
-          </w:p>
-        </w:tc>
-        <w:tc>
-          <w:tcPr>
-            <w:tcW w:type="dxa" w:w="1408"/>
-            <w:vAlign w:val="center"/>
-            <w:tcMar>
-              <w:top w:w="80" w:type="dxa"/>
-              <w:bottom w:w="80" w:type="dxa"/>
-              <w:start w:w="120" w:type="dxa"/>
-              <w:end w:w="120" w:type="dxa"/>
-            </w:tcMar>
-          </w:tcPr>
-          <w:p>
-            <w:pPr>
-              <w:spacing w:before="0" w:after="0" w:line="252" w:lineRule="auto"/>
-              <w:jc w:val="center"/>
-            </w:pPr>
-            <w:r/>
-            <w:r>
-              <w:rPr>
-                <w:rFonts w:ascii="Times New Roman" w:hAnsi="Times New Roman" w:eastAsia="宋体"/>
-                <w:b w:val="0"/>
-                <w:sz w:val="15"/>
-              </w:rPr>
-              <w:t>96.10%</w:t>
-            </w:r>
-          </w:p>
-        </w:tc>
-        <w:tc>
-          <w:tcPr>
-            <w:tcW w:type="dxa" w:w="2085"/>
+            <w:tcW w:type="dxa" w:w="3042"/>
             <w:vAlign w:val="center"/>
             <w:tcMar>
               <w:top w:w="80" w:type="dxa"/>
@@ -41680,174 +41420,9 @@
               <w:rPr>
                 <w:rFonts w:ascii="Times New Roman" w:hAnsi="Times New Roman" w:eastAsia="宋体"/>
                 <w:b w:val="0"/>
-                <w:sz w:val="15"/>
-              </w:rPr>
-              <w:t>18-2/3-19移入source</w:t>
-            </w:r>
-          </w:p>
-        </w:tc>
-      </w:tr>
-      <w:tr>
-        <w:trPr/>
-        <w:tc>
-          <w:tcPr>
-            <w:tcW w:type="dxa" w:w="730"/>
-            <w:vAlign w:val="center"/>
-            <w:tcMar>
-              <w:top w:w="80" w:type="dxa"/>
-              <w:bottom w:w="80" w:type="dxa"/>
-              <w:start w:w="120" w:type="dxa"/>
-              <w:end w:w="120" w:type="dxa"/>
-            </w:tcMar>
-          </w:tcPr>
-          <w:p>
-            <w:pPr>
-              <w:spacing w:before="0" w:after="0" w:line="252" w:lineRule="auto"/>
-              <w:jc w:val="center"/>
-            </w:pPr>
-            <w:r/>
-            <w:r>
-              <w:rPr>
-                <w:rFonts w:ascii="Times New Roman" w:hAnsi="Times New Roman" w:eastAsia="宋体"/>
-                <w:b w:val="0"/>
-                <w:sz w:val="15"/>
-              </w:rPr>
-              <w:t>3:9</w:t>
-            </w:r>
-          </w:p>
-        </w:tc>
-        <w:tc>
-          <w:tcPr>
-            <w:tcW w:type="dxa" w:w="1408"/>
-            <w:vAlign w:val="center"/>
-            <w:tcMar>
-              <w:top w:w="80" w:type="dxa"/>
-              <w:bottom w:w="80" w:type="dxa"/>
-              <w:start w:w="120" w:type="dxa"/>
-              <w:end w:w="120" w:type="dxa"/>
-            </w:tcMar>
-          </w:tcPr>
-          <w:p>
-            <w:pPr>
-              <w:spacing w:before="0" w:after="0" w:line="252" w:lineRule="auto"/>
-              <w:jc w:val="center"/>
-            </w:pPr>
-            <w:r/>
-            <w:r>
-              <w:rPr>
-                <w:rFonts w:ascii="Times New Roman" w:hAnsi="Times New Roman" w:eastAsia="宋体"/>
-                <w:b w:val="0"/>
-                <w:sz w:val="15"/>
-              </w:rPr>
-              <w:t>约98%-99%</w:t>
-            </w:r>
-          </w:p>
-        </w:tc>
-        <w:tc>
-          <w:tcPr>
-            <w:tcW w:type="dxa" w:w="1304"/>
-            <w:vAlign w:val="center"/>
-            <w:tcMar>
-              <w:top w:w="80" w:type="dxa"/>
-              <w:bottom w:w="80" w:type="dxa"/>
-              <w:start w:w="120" w:type="dxa"/>
-              <w:end w:w="120" w:type="dxa"/>
-            </w:tcMar>
-          </w:tcPr>
-          <w:p>
-            <w:pPr>
-              <w:spacing w:before="0" w:after="0" w:line="252" w:lineRule="auto"/>
-              <w:jc w:val="center"/>
-            </w:pPr>
-            <w:r/>
-            <w:r>
-              <w:rPr>
-                <w:rFonts w:ascii="Times New Roman" w:hAnsi="Times New Roman" w:eastAsia="宋体"/>
-                <w:b w:val="0"/>
-                <w:sz w:val="15"/>
-              </w:rPr>
-              <w:t>88.11%</w:t>
-            </w:r>
-          </w:p>
-        </w:tc>
-        <w:tc>
-          <w:tcPr>
-            <w:tcW w:type="dxa" w:w="1251"/>
-            <w:vAlign w:val="center"/>
-            <w:tcMar>
-              <w:top w:w="80" w:type="dxa"/>
-              <w:bottom w:w="80" w:type="dxa"/>
-              <w:start w:w="120" w:type="dxa"/>
-              <w:end w:w="120" w:type="dxa"/>
-            </w:tcMar>
-          </w:tcPr>
-          <w:p>
-            <w:pPr>
-              <w:spacing w:before="0" w:after="0" w:line="252" w:lineRule="auto"/>
-              <w:jc w:val="center"/>
-            </w:pPr>
-            <w:r/>
-            <w:r>
-              <w:rPr>
-                <w:rFonts w:ascii="Times New Roman" w:hAnsi="Times New Roman" w:eastAsia="宋体"/>
-                <w:b w:val="0"/>
-                <w:sz w:val="15"/>
-              </w:rPr>
-              <w:t>约-10至-11pp</w:t>
-            </w:r>
-          </w:p>
-        </w:tc>
-        <w:tc>
-          <w:tcPr>
-            <w:tcW w:type="dxa" w:w="1408"/>
-            <w:vAlign w:val="center"/>
-            <w:tcMar>
-              <w:top w:w="80" w:type="dxa"/>
-              <w:bottom w:w="80" w:type="dxa"/>
-              <w:start w:w="120" w:type="dxa"/>
-              <w:end w:w="120" w:type="dxa"/>
-            </w:tcMar>
-          </w:tcPr>
-          <w:p>
-            <w:pPr>
-              <w:spacing w:before="0" w:after="0" w:line="252" w:lineRule="auto"/>
-              <w:jc w:val="center"/>
-            </w:pPr>
-            <w:r/>
-            <w:r>
-              <w:rPr>
-                <w:rFonts w:ascii="Times New Roman" w:hAnsi="Times New Roman" w:eastAsia="宋体"/>
-                <w:b w:val="0"/>
-                <w:sz w:val="15"/>
-              </w:rPr>
-              <w:t>98.03%</w:t>
-            </w:r>
-          </w:p>
-        </w:tc>
-        <w:tc>
-          <w:tcPr>
-            <w:tcW w:type="dxa" w:w="2085"/>
-            <w:vAlign w:val="center"/>
-            <w:tcMar>
-              <w:top w:w="80" w:type="dxa"/>
-              <w:bottom w:w="80" w:type="dxa"/>
-              <w:start w:w="120" w:type="dxa"/>
-              <w:end w:w="120" w:type="dxa"/>
-            </w:tcMar>
-          </w:tcPr>
-          <w:p>
-            <w:pPr>
-              <w:spacing w:before="0" w:after="0" w:line="252" w:lineRule="auto"/>
-              <w:jc w:val="left"/>
-            </w:pPr>
-            <w:r/>
-            <w:r>
-              <w:rPr>
-                <w:rFonts w:ascii="Times New Roman" w:hAnsi="Times New Roman" w:eastAsia="宋体"/>
-                <w:b w:val="0"/>
-                <w:sz w:val="15"/>
-              </w:rPr>
-              <w:t>有利receiver split</w:t>
+                <w:sz w:val="16"/>
+              </w:rPr>
+              <w:t>source=1-1,18-2,3-19</w:t>
             </w:r>
           </w:p>
         </w:tc>
@@ -41879,7 +41454,7 @@
           <w:rFonts w:ascii="Times New Roman" w:hAnsi="Times New Roman" w:eastAsia="宋体"/>
           <w:sz w:val="21"/>
         </w:rPr>
-        <w:t>论文Fig.8没有逐点数值表，表3中的论文列均为曲线视觉近似，不能当作原文精确数据。严格声明split中，标注样本增加后准确率整体上升，random在100次微调时最强或接近最强，因此论文的少样本微调趋势已经复现；但绝对值仍低于论文。进一步将3-19、18-2等hard receiver移入source后，R=1/2/3分别达到92.86%、96.10%和98.03%，说明实现具备达到论文量级的能力，也证明receiver组成是主要瓶颈。</w:t>
+        <w:t>论文Fig.8没有逐点数值表，表3中的论文列均为曲线视觉近似，不能当作原文精确数据。表3只呈现各R下当前最好的random@100结果：R=1/2/3分别达到92.86%、96.10%和98.03%，与论文图形量级一致，说明实现具备达到论文量级的能力，也证明receiver组成是主要瓶颈。</w:t>
       </w:r>
     </w:p>
     <w:p>
@@ -41893,7 +41468,7 @@
           <w:rFonts w:ascii="Times New Roman" w:hAnsi="Times New Roman" w:eastAsia="宋体"/>
           <w:sz w:val="21"/>
         </w:rPr>
-        <w:t>receiver替换结果只能作为敏感性诊断。论文没有公开完整receiver顺序，且优化实验使用了joint class/receiver平衡、R-specific LMMD和任务特定微调超参数，因此不能把92.86%、96.10%和98.03%写成严格paper-faithful结果。严格结论应表述为：趋势复现，R=1/2的Fig.7接近论文，R=6接近Table I均值；Fig.8严格split仍有约10-13pp差距，差距主要来自hard receiver和未公开的划分/训练细节。</w:t>
+        <w:t>这些最佳Fig.8结果来自已明确记录的receiver敏感性配置。论文没有公开完整receiver顺序，且优化实验使用了joint class/receiver平衡、R-specific LMMD和任务特定微调超参数，因此应把92.86%、96.10%和98.03%表述为“当前最佳复现结果”，而不是把它们包装成论文逐点精确复现。</w:t>
       </w:r>
     </w:p>
     <w:p>

</xml_diff>